<commit_message>
add more graphics and rewrite
</commit_message>
<xml_diff>
--- a/теорія/теорія2.docx
+++ b/теорія/теорія2.docx
@@ -590,6 +590,67 @@
         <w:pStyle w:val="a7"/>
       </w:pPr>
       <w:r>
+        <w:rPr>
+          <w:noProof/>
+        </w:rPr>
+        <w:drawing>
+          <wp:anchor distT="0" distB="0" distL="114300" distR="114300" simplePos="0" relativeHeight="251658240" behindDoc="0" locked="0" layoutInCell="1" allowOverlap="1" wp14:anchorId="43BA31B9" wp14:editId="59125734">
+            <wp:simplePos x="0" y="0"/>
+            <wp:positionH relativeFrom="column">
+              <wp:posOffset>15137</wp:posOffset>
+            </wp:positionH>
+            <wp:positionV relativeFrom="paragraph">
+              <wp:posOffset>2087279</wp:posOffset>
+            </wp:positionV>
+            <wp:extent cx="2784475" cy="1021715"/>
+            <wp:effectExtent l="0" t="0" r="0" b="6985"/>
+            <wp:wrapSquare wrapText="bothSides"/>
+            <wp:docPr id="24" name="Рисунок 24" descr="C:\Users\temaune\AppData\Local\Microsoft\Windows\INetCache\Content.Word\images.png"/>
+            <wp:cNvGraphicFramePr>
+              <a:graphicFrameLocks xmlns:a="http://schemas.openxmlformats.org/drawingml/2006/main" noChangeAspect="1"/>
+            </wp:cNvGraphicFramePr>
+            <a:graphic xmlns:a="http://schemas.openxmlformats.org/drawingml/2006/main">
+              <a:graphicData uri="http://schemas.openxmlformats.org/drawingml/2006/picture">
+                <pic:pic xmlns:pic="http://schemas.openxmlformats.org/drawingml/2006/picture">
+                  <pic:nvPicPr>
+                    <pic:cNvPr id="0" name="Picture 5" descr="C:\Users\temaune\AppData\Local\Microsoft\Windows\INetCache\Content.Word\images.png"/>
+                    <pic:cNvPicPr>
+                      <a:picLocks noChangeAspect="1" noChangeArrowheads="1"/>
+                    </pic:cNvPicPr>
+                  </pic:nvPicPr>
+                  <pic:blipFill>
+                    <a:blip r:embed="rId6">
+                      <a:extLst>
+                        <a:ext uri="{28A0092B-C50C-407E-A947-70E740481C1C}">
+                          <a14:useLocalDpi xmlns:a14="http://schemas.microsoft.com/office/drawing/2010/main" val="0"/>
+                        </a:ext>
+                      </a:extLst>
+                    </a:blip>
+                    <a:srcRect/>
+                    <a:stretch>
+                      <a:fillRect/>
+                    </a:stretch>
+                  </pic:blipFill>
+                  <pic:spPr bwMode="auto">
+                    <a:xfrm>
+                      <a:off x="0" y="0"/>
+                      <a:ext cx="2784475" cy="1021715"/>
+                    </a:xfrm>
+                    <a:prstGeom prst="rect">
+                      <a:avLst/>
+                    </a:prstGeom>
+                    <a:noFill/>
+                    <a:ln>
+                      <a:noFill/>
+                    </a:ln>
+                  </pic:spPr>
+                </pic:pic>
+              </a:graphicData>
+            </a:graphic>
+          </wp:anchor>
+        </w:drawing>
+      </w:r>
+      <w:r>
         <w:t xml:space="preserve">Саме в цей критичний момент на конференції НАТО у 1968 році було вперше офіційно вжито термін «програмна інженерія», що ознаменувало початок пошуку наукових та системних методів розробки </w:t>
       </w:r>
       <w:proofErr w:type="spellStart"/>
@@ -758,6 +819,73 @@
         <w:pStyle w:val="a7"/>
       </w:pPr>
       <w:r>
+        <w:rPr>
+          <w:noProof/>
+        </w:rPr>
+        <w:drawing>
+          <wp:anchor distT="0" distB="0" distL="114300" distR="114300" simplePos="0" relativeHeight="251659264" behindDoc="0" locked="0" layoutInCell="1" allowOverlap="1" wp14:anchorId="10AF1EAC" wp14:editId="29385493">
+            <wp:simplePos x="0" y="0"/>
+            <wp:positionH relativeFrom="margin">
+              <wp:align>left</wp:align>
+            </wp:positionH>
+            <wp:positionV relativeFrom="paragraph">
+              <wp:posOffset>4513</wp:posOffset>
+            </wp:positionV>
+            <wp:extent cx="1400175" cy="1400175"/>
+            <wp:effectExtent l="0" t="0" r="9525" b="9525"/>
+            <wp:wrapSquare wrapText="bothSides"/>
+            <wp:docPr id="25" name="Рисунок 25" descr="C:\Users\temaune\Desktop\DynamicWallpaper2\теорія\всяке\Логотип_Java.png"/>
+            <wp:cNvGraphicFramePr>
+              <a:graphicFrameLocks xmlns:a="http://schemas.openxmlformats.org/drawingml/2006/main" noChangeAspect="1"/>
+            </wp:cNvGraphicFramePr>
+            <a:graphic xmlns:a="http://schemas.openxmlformats.org/drawingml/2006/main">
+              <a:graphicData uri="http://schemas.openxmlformats.org/drawingml/2006/picture">
+                <pic:pic xmlns:pic="http://schemas.openxmlformats.org/drawingml/2006/picture">
+                  <pic:nvPicPr>
+                    <pic:cNvPr id="0" name="Picture 6" descr="C:\Users\temaune\Desktop\DynamicWallpaper2\теорія\всяке\Логотип_Java.png"/>
+                    <pic:cNvPicPr>
+                      <a:picLocks noChangeAspect="1" noChangeArrowheads="1"/>
+                    </pic:cNvPicPr>
+                  </pic:nvPicPr>
+                  <pic:blipFill>
+                    <a:blip r:embed="rId7">
+                      <a:extLst>
+                        <a:ext uri="{28A0092B-C50C-407E-A947-70E740481C1C}">
+                          <a14:useLocalDpi xmlns:a14="http://schemas.microsoft.com/office/drawing/2010/main" val="0"/>
+                        </a:ext>
+                      </a:extLst>
+                    </a:blip>
+                    <a:srcRect/>
+                    <a:stretch>
+                      <a:fillRect/>
+                    </a:stretch>
+                  </pic:blipFill>
+                  <pic:spPr bwMode="auto">
+                    <a:xfrm>
+                      <a:off x="0" y="0"/>
+                      <a:ext cx="1400175" cy="1400175"/>
+                    </a:xfrm>
+                    <a:prstGeom prst="rect">
+                      <a:avLst/>
+                    </a:prstGeom>
+                    <a:noFill/>
+                    <a:ln>
+                      <a:noFill/>
+                    </a:ln>
+                  </pic:spPr>
+                </pic:pic>
+              </a:graphicData>
+            </a:graphic>
+            <wp14:sizeRelH relativeFrom="page">
+              <wp14:pctWidth>0</wp14:pctWidth>
+            </wp14:sizeRelH>
+            <wp14:sizeRelV relativeFrom="page">
+              <wp14:pctHeight>0</wp14:pctHeight>
+            </wp14:sizeRelV>
+          </wp:anchor>
+        </w:drawing>
+      </w:r>
+      <w:r>
         <w:t xml:space="preserve">Наступний великий крок стався у середині дев’яностих із появою мови </w:t>
       </w:r>
       <w:proofErr w:type="spellStart"/>
@@ -1040,28 +1168,6 @@
       <w:r>
         <w:t>Успіх цих технологічних рішень був би неможливим без формування потужної інфраструктури розробки, яку створили провідні світові технологічні гіганти. Саме еволюція мов програмування та архітектурних підходів створила передумови для появи глобального ринку програмних продуктів, де кожна корпорація пропонує власні інструменти для реалізації найсміливіших ідей розробників. Глибоке розуміння того, як об’єктно-орієнтоване програмування пройшло шлях від академічних досліджень до фундаменту сучасних мультимедійних систем, дозволяє об’єктивно оцінити роль сучасних середовищ розробки та мов програмування, що панують на ринку сьогодні. Це закономірно підводить до необхідності детального аналізу поточного стану програмного ринку та ролі провідних корпорацій, які визначають вектори розвитку технологій, що використовуються для створення інноваційних програмних продуктів, зокрема і засобів персоналізації системного інтерфейсу.</w:t>
       </w:r>
-    </w:p>
-    <w:p>
-      <w:pPr>
-        <w:spacing w:line="360" w:lineRule="auto"/>
-        <w:rPr>
-          <w:rFonts w:ascii="Times New Roman" w:hAnsi="Times New Roman"/>
-          <w:bCs/>
-          <w:sz w:val="28"/>
-          <w:szCs w:val="28"/>
-        </w:rPr>
-      </w:pPr>
-    </w:p>
-    <w:p>
-      <w:pPr>
-        <w:spacing w:line="360" w:lineRule="auto"/>
-        <w:rPr>
-          <w:rFonts w:ascii="Times New Roman" w:hAnsi="Times New Roman"/>
-          <w:bCs/>
-          <w:sz w:val="28"/>
-          <w:szCs w:val="28"/>
-        </w:rPr>
-      </w:pPr>
     </w:p>
     <w:p>
       <w:pPr>
@@ -1313,6 +1419,70 @@
         <w:pStyle w:val="a7"/>
       </w:pPr>
       <w:r>
+        <w:rPr>
+          <w:noProof/>
+        </w:rPr>
+        <w:drawing>
+          <wp:anchor distT="0" distB="0" distL="114300" distR="114300" simplePos="0" relativeHeight="251660288" behindDoc="0" locked="0" layoutInCell="1" allowOverlap="1" wp14:anchorId="22D6C2DC" wp14:editId="23FE2A6B">
+            <wp:simplePos x="0" y="0"/>
+            <wp:positionH relativeFrom="column">
+              <wp:posOffset>2129155</wp:posOffset>
+            </wp:positionH>
+            <wp:positionV relativeFrom="paragraph">
+              <wp:posOffset>2193290</wp:posOffset>
+            </wp:positionV>
+            <wp:extent cx="1703070" cy="1621155"/>
+            <wp:effectExtent l="0" t="0" r="0" b="0"/>
+            <wp:wrapTopAndBottom/>
+            <wp:docPr id="26" name="Рисунок 26" descr="C:\Users\temaune\Desktop\DynamicWallpaper2\теорія\всяке\wallpaper_engine_android2.PNG"/>
+            <wp:cNvGraphicFramePr>
+              <a:graphicFrameLocks xmlns:a="http://schemas.openxmlformats.org/drawingml/2006/main" noChangeAspect="1"/>
+            </wp:cNvGraphicFramePr>
+            <a:graphic xmlns:a="http://schemas.openxmlformats.org/drawingml/2006/main">
+              <a:graphicData uri="http://schemas.openxmlformats.org/drawingml/2006/picture">
+                <pic:pic xmlns:pic="http://schemas.openxmlformats.org/drawingml/2006/picture">
+                  <pic:nvPicPr>
+                    <pic:cNvPr id="0" name="Picture 8" descr="C:\Users\temaune\Desktop\DynamicWallpaper2\теорія\всяке\wallpaper_engine_android2.PNG"/>
+                    <pic:cNvPicPr>
+                      <a:picLocks noChangeAspect="1" noChangeArrowheads="1"/>
+                    </pic:cNvPicPr>
+                  </pic:nvPicPr>
+                  <pic:blipFill>
+                    <a:blip r:embed="rId8">
+                      <a:extLst>
+                        <a:ext uri="{28A0092B-C50C-407E-A947-70E740481C1C}">
+                          <a14:useLocalDpi xmlns:a14="http://schemas.microsoft.com/office/drawing/2010/main" val="0"/>
+                        </a:ext>
+                      </a:extLst>
+                    </a:blip>
+                    <a:srcRect/>
+                    <a:stretch>
+                      <a:fillRect/>
+                    </a:stretch>
+                  </pic:blipFill>
+                  <pic:spPr bwMode="auto">
+                    <a:xfrm flipV="1">
+                      <a:off x="0" y="0"/>
+                      <a:ext cx="1703070" cy="1621155"/>
+                    </a:xfrm>
+                    <a:prstGeom prst="rect">
+                      <a:avLst/>
+                    </a:prstGeom>
+                    <a:noFill/>
+                    <a:ln>
+                      <a:noFill/>
+                    </a:ln>
+                  </pic:spPr>
+                </pic:pic>
+              </a:graphicData>
+            </a:graphic>
+            <wp14:sizeRelH relativeFrom="margin">
+              <wp14:pctWidth>0</wp14:pctWidth>
+            </wp14:sizeRelH>
+          </wp:anchor>
+        </w:drawing>
+      </w:r>
+      <w:r>
         <w:t xml:space="preserve">Розвиток цих корпоративних екосистем та інструментів розробки створив сприятливий ґрунт для появи </w:t>
       </w:r>
       <w:proofErr w:type="spellStart"/>
@@ -1483,17 +1653,6 @@
       <w:r>
         <w:t xml:space="preserve"> підводить до розгляду питань ліцензування, які регламентують використання потужних інструментів розробки та захищають інтелектуальну власність авторів програмних продуктів.</w:t>
       </w:r>
-    </w:p>
-    <w:p>
-      <w:pPr>
-        <w:spacing w:line="360" w:lineRule="auto"/>
-        <w:rPr>
-          <w:rFonts w:ascii="Times New Roman" w:hAnsi="Times New Roman"/>
-          <w:bCs/>
-          <w:sz w:val="28"/>
-          <w:szCs w:val="28"/>
-        </w:rPr>
-      </w:pPr>
     </w:p>
     <w:p>
       <w:pPr>
@@ -1695,6 +1854,64 @@
         <w:pStyle w:val="a7"/>
       </w:pPr>
       <w:r>
+        <w:rPr>
+          <w:noProof/>
+        </w:rPr>
+        <w:drawing>
+          <wp:inline distT="0" distB="0" distL="0" distR="0">
+            <wp:extent cx="6120130" cy="4080087"/>
+            <wp:effectExtent l="0" t="0" r="0" b="0"/>
+            <wp:docPr id="27" name="Рисунок 27" descr="C:\Users\temaune\Desktop\DynamicWallpaper2\теорія\всяке\графіка 4.png"/>
+            <wp:cNvGraphicFramePr>
+              <a:graphicFrameLocks xmlns:a="http://schemas.openxmlformats.org/drawingml/2006/main" noChangeAspect="1"/>
+            </wp:cNvGraphicFramePr>
+            <a:graphic xmlns:a="http://schemas.openxmlformats.org/drawingml/2006/main">
+              <a:graphicData uri="http://schemas.openxmlformats.org/drawingml/2006/picture">
+                <pic:pic xmlns:pic="http://schemas.openxmlformats.org/drawingml/2006/picture">
+                  <pic:nvPicPr>
+                    <pic:cNvPr id="0" name="Picture 10" descr="C:\Users\temaune\Desktop\DynamicWallpaper2\теорія\всяке\графіка 4.png"/>
+                    <pic:cNvPicPr>
+                      <a:picLocks noChangeAspect="1" noChangeArrowheads="1"/>
+                    </pic:cNvPicPr>
+                  </pic:nvPicPr>
+                  <pic:blipFill>
+                    <a:blip r:embed="rId9" cstate="print">
+                      <a:extLst>
+                        <a:ext uri="{28A0092B-C50C-407E-A947-70E740481C1C}">
+                          <a14:useLocalDpi xmlns:a14="http://schemas.microsoft.com/office/drawing/2010/main" val="0"/>
+                        </a:ext>
+                      </a:extLst>
+                    </a:blip>
+                    <a:srcRect/>
+                    <a:stretch>
+                      <a:fillRect/>
+                    </a:stretch>
+                  </pic:blipFill>
+                  <pic:spPr bwMode="auto">
+                    <a:xfrm>
+                      <a:off x="0" y="0"/>
+                      <a:ext cx="6120130" cy="4080087"/>
+                    </a:xfrm>
+                    <a:prstGeom prst="rect">
+                      <a:avLst/>
+                    </a:prstGeom>
+                    <a:noFill/>
+                    <a:ln>
+                      <a:noFill/>
+                    </a:ln>
+                  </pic:spPr>
+                </pic:pic>
+              </a:graphicData>
+            </a:graphic>
+          </wp:inline>
+        </w:drawing>
+      </w:r>
+    </w:p>
+    <w:p>
+      <w:pPr>
+        <w:pStyle w:val="a7"/>
+      </w:pPr>
+      <w:r>
         <w:t xml:space="preserve">Переваги використання саме ліцензійного програмного забезпечення, незалежно від того, чи є воно платним чи вільним, полягають передусім у безпеці та стабільності. Легальні програмні продукти отримують регулярні </w:t>
       </w:r>
       <w:proofErr w:type="spellStart"/>
@@ -1777,105 +1994,6 @@
       <w:r>
         <w:t xml:space="preserve"> передує глибокому вивченню архітектурних засад програмування, оскільки лише на базі ліцензійного та безпечного інструментарію можна впроваджувати передові інженерні методики, такі як принципи SOLID, що забезпечують якість та довговічність створюваного програмного забезпечення.</w:t>
       </w:r>
-    </w:p>
-    <w:p>
-      <w:pPr>
-        <w:spacing w:line="360" w:lineRule="auto"/>
-        <w:rPr>
-          <w:rFonts w:ascii="Times New Roman" w:hAnsi="Times New Roman"/>
-          <w:bCs/>
-          <w:sz w:val="28"/>
-          <w:szCs w:val="28"/>
-        </w:rPr>
-      </w:pPr>
-    </w:p>
-    <w:p>
-      <w:pPr>
-        <w:spacing w:line="360" w:lineRule="auto"/>
-        <w:rPr>
-          <w:rFonts w:ascii="Times New Roman" w:hAnsi="Times New Roman"/>
-          <w:bCs/>
-          <w:sz w:val="28"/>
-          <w:szCs w:val="28"/>
-        </w:rPr>
-      </w:pPr>
-    </w:p>
-    <w:p>
-      <w:pPr>
-        <w:spacing w:line="360" w:lineRule="auto"/>
-        <w:rPr>
-          <w:rFonts w:ascii="Times New Roman" w:hAnsi="Times New Roman"/>
-          <w:bCs/>
-          <w:sz w:val="28"/>
-          <w:szCs w:val="28"/>
-        </w:rPr>
-      </w:pPr>
-    </w:p>
-    <w:p>
-      <w:pPr>
-        <w:spacing w:line="360" w:lineRule="auto"/>
-        <w:rPr>
-          <w:rFonts w:ascii="Times New Roman" w:hAnsi="Times New Roman"/>
-          <w:bCs/>
-          <w:sz w:val="28"/>
-          <w:szCs w:val="28"/>
-        </w:rPr>
-      </w:pPr>
-    </w:p>
-    <w:p>
-      <w:pPr>
-        <w:spacing w:line="360" w:lineRule="auto"/>
-        <w:rPr>
-          <w:rFonts w:ascii="Times New Roman" w:hAnsi="Times New Roman"/>
-          <w:bCs/>
-          <w:sz w:val="28"/>
-          <w:szCs w:val="28"/>
-        </w:rPr>
-      </w:pPr>
-    </w:p>
-    <w:p>
-      <w:pPr>
-        <w:spacing w:line="360" w:lineRule="auto"/>
-        <w:rPr>
-          <w:rFonts w:ascii="Times New Roman" w:hAnsi="Times New Roman"/>
-          <w:bCs/>
-          <w:sz w:val="28"/>
-          <w:szCs w:val="28"/>
-        </w:rPr>
-      </w:pPr>
-    </w:p>
-    <w:p>
-      <w:pPr>
-        <w:spacing w:line="360" w:lineRule="auto"/>
-        <w:rPr>
-          <w:rFonts w:ascii="Times New Roman" w:hAnsi="Times New Roman"/>
-          <w:bCs/>
-          <w:sz w:val="28"/>
-          <w:szCs w:val="28"/>
-        </w:rPr>
-      </w:pPr>
-    </w:p>
-    <w:p>
-      <w:pPr>
-        <w:spacing w:line="360" w:lineRule="auto"/>
-        <w:rPr>
-          <w:rFonts w:ascii="Times New Roman" w:hAnsi="Times New Roman"/>
-          <w:bCs/>
-          <w:sz w:val="28"/>
-          <w:szCs w:val="28"/>
-        </w:rPr>
-      </w:pPr>
-    </w:p>
-    <w:p>
-      <w:pPr>
-        <w:spacing w:line="360" w:lineRule="auto"/>
-        <w:rPr>
-          <w:rFonts w:ascii="Times New Roman" w:hAnsi="Times New Roman"/>
-          <w:bCs/>
-          <w:sz w:val="28"/>
-          <w:szCs w:val="28"/>
-        </w:rPr>
-      </w:pPr>
     </w:p>
     <w:p>
       <w:pPr>
@@ -2228,6 +2346,64 @@
         <w:pStyle w:val="a7"/>
       </w:pPr>
       <w:r>
+        <w:rPr>
+          <w:noProof/>
+        </w:rPr>
+        <w:drawing>
+          <wp:inline distT="0" distB="0" distL="0" distR="0">
+            <wp:extent cx="6120130" cy="3836499"/>
+            <wp:effectExtent l="0" t="0" r="0" b="0"/>
+            <wp:docPr id="29" name="Рисунок 29" descr="C:\Users\temaune\AppData\Local\Microsoft\Windows\INetCache\Content.Word\графіка 5.png"/>
+            <wp:cNvGraphicFramePr>
+              <a:graphicFrameLocks xmlns:a="http://schemas.openxmlformats.org/drawingml/2006/main" noChangeAspect="1"/>
+            </wp:cNvGraphicFramePr>
+            <a:graphic xmlns:a="http://schemas.openxmlformats.org/drawingml/2006/main">
+              <a:graphicData uri="http://schemas.openxmlformats.org/drawingml/2006/picture">
+                <pic:pic xmlns:pic="http://schemas.openxmlformats.org/drawingml/2006/picture">
+                  <pic:nvPicPr>
+                    <pic:cNvPr id="0" name="Picture 16" descr="C:\Users\temaune\AppData\Local\Microsoft\Windows\INetCache\Content.Word\графіка 5.png"/>
+                    <pic:cNvPicPr>
+                      <a:picLocks noChangeAspect="1" noChangeArrowheads="1"/>
+                    </pic:cNvPicPr>
+                  </pic:nvPicPr>
+                  <pic:blipFill>
+                    <a:blip r:embed="rId10" cstate="print">
+                      <a:extLst>
+                        <a:ext uri="{28A0092B-C50C-407E-A947-70E740481C1C}">
+                          <a14:useLocalDpi xmlns:a14="http://schemas.microsoft.com/office/drawing/2010/main" val="0"/>
+                        </a:ext>
+                      </a:extLst>
+                    </a:blip>
+                    <a:srcRect/>
+                    <a:stretch>
+                      <a:fillRect/>
+                    </a:stretch>
+                  </pic:blipFill>
+                  <pic:spPr bwMode="auto">
+                    <a:xfrm>
+                      <a:off x="0" y="0"/>
+                      <a:ext cx="6120130" cy="3836499"/>
+                    </a:xfrm>
+                    <a:prstGeom prst="rect">
+                      <a:avLst/>
+                    </a:prstGeom>
+                    <a:noFill/>
+                    <a:ln>
+                      <a:noFill/>
+                    </a:ln>
+                  </pic:spPr>
+                </pic:pic>
+              </a:graphicData>
+            </a:graphic>
+          </wp:inline>
+        </w:drawing>
+      </w:r>
+    </w:p>
+    <w:p>
+      <w:pPr>
+        <w:pStyle w:val="a7"/>
+      </w:pPr>
+      <w:r>
         <w:t>Важливою частиною сучасної об’єктно-</w:t>
       </w:r>
       <w:proofErr w:type="spellStart"/>
@@ -2302,7 +2478,6 @@
       <w:r>
         <w:t xml:space="preserve"> чи вбудовані засоби </w:t>
       </w:r>
-      <w:bookmarkStart w:id="0" w:name="_GoBack"/>
       <w:proofErr w:type="spellStart"/>
       <w:r>
         <w:t>Python</w:t>
@@ -2317,11 +2492,7 @@
       </w:r>
       <w:proofErr w:type="spellEnd"/>
       <w:r>
-        <w:t xml:space="preserve">. Це дозволяє розробникам писати </w:t>
-      </w:r>
-      <w:bookmarkEnd w:id="0"/>
-      <w:r>
-        <w:t xml:space="preserve">код, який керує іншим кодом, створюючи динамічні проксі-об’єкти, анотації та декоратори. Завдяки цьому архітектура стає декларативною: ми описуємо «що» ми хочемо отримати за допомогою метаданих, а система сама вирішує, «як» це реалізувати, аналізуючи об’єкти через механізми рефлексії. Це кардинально змінює підхід до побудови </w:t>
+        <w:t xml:space="preserve">. Це дозволяє розробникам писати код, який керує іншим кодом, створюючи динамічні проксі-об’єкти, анотації та декоратори. Завдяки цьому архітектура стає декларативною: ми описуємо «що» ми хочемо отримати за допомогою метаданих, а система сама вирішує, «як» це реалізувати, аналізуючи об’єкти через механізми рефлексії. Це кардинально змінює підхід до побудови </w:t>
       </w:r>
       <w:proofErr w:type="spellStart"/>
       <w:r>
@@ -2777,9 +2948,45 @@
           <w:lang w:val="en-US"/>
         </w:rPr>
       </w:pPr>
+      <w:r>
+        <w:rPr>
+          <w:rFonts w:ascii="Times New Roman" w:hAnsi="Times New Roman"/>
+          <w:bCs/>
+          <w:color w:val="FF0000"/>
+          <w:sz w:val="28"/>
+          <w:szCs w:val="28"/>
+          <w:lang w:val="en-US"/>
+        </w:rPr>
+        <w:pict>
+          <v:shapetype id="_x0000_t75" coordsize="21600,21600" o:spt="75" o:preferrelative="t" path="m@4@5l@4@11@9@11@9@5xe" filled="f" stroked="f">
+            <v:stroke joinstyle="miter"/>
+            <v:formulas>
+              <v:f eqn="if lineDrawn pixelLineWidth 0"/>
+              <v:f eqn="sum @0 1 0"/>
+              <v:f eqn="sum 0 0 @1"/>
+              <v:f eqn="prod @2 1 2"/>
+              <v:f eqn="prod @3 21600 pixelWidth"/>
+              <v:f eqn="prod @3 21600 pixelHeight"/>
+              <v:f eqn="sum @0 0 1"/>
+              <v:f eqn="prod @6 1 2"/>
+              <v:f eqn="prod @7 21600 pixelWidth"/>
+              <v:f eqn="sum @8 21600 0"/>
+              <v:f eqn="prod @7 21600 pixelHeight"/>
+              <v:f eqn="sum @10 21600 0"/>
+            </v:formulas>
+            <v:path o:extrusionok="f" gradientshapeok="t" o:connecttype="rect"/>
+            <o:lock v:ext="edit" aspectratio="t"/>
+          </v:shapetype>
+          <v:shape id="_x0000_i1043" type="#_x0000_t75" style="width:481.35pt;height:321.35pt">
+            <v:imagedata r:id="rId11" o:title="графіка6"/>
+          </v:shape>
+        </w:pict>
+      </w:r>
+      <w:bookmarkStart w:id="0" w:name="_GoBack"/>
+      <w:bookmarkEnd w:id="0"/>
     </w:p>
     <w:sectPr>
-      <w:headerReference w:type="default" r:id="rId6"/>
+      <w:headerReference w:type="default" r:id="rId12"/>
       <w:pgSz w:w="11906" w:h="16838"/>
       <w:pgMar w:top="1134" w:right="567" w:bottom="1701" w:left="1701" w:header="709" w:footer="709" w:gutter="0"/>
       <w:cols w:space="708"/>
@@ -4435,6 +4642,7 @@
   <w:style w:type="character" w:default="1" w:styleId="a0">
     <w:name w:val="Default Paragraph Font"/>
     <w:uiPriority w:val="1"/>
+    <w:semiHidden/>
     <w:unhideWhenUsed/>
   </w:style>
   <w:style w:type="table" w:default="1" w:styleId="a1">

</xml_diff>